<commit_message>
Part B continuous gradient: yellow->orange->red (was white->red)
Co-Authored-By: Claude Opus 4.8 <noreply@anthropic.com>
</commit_message>
<xml_diff>
--- a/docs/tables/heatmap/cont_index_carboplatin_b15_overdose.docx
+++ b/docs/tables/heatmap/cont_index_carboplatin_b15_overdose.docx
@@ -1594,7 +1594,7 @@
               <w:left w:val="none" w:sz="0" w:space="0" w:color="000000"/>
               <w:right w:val="none" w:sz="0" w:space="0" w:color="000000"/>
             </w:tcBorders>
-            <w:shd w:val="clear" w:color="auto" w:fill="B92F40"/>
+            <w:shd w:val="clear" w:color="auto" w:fill="C42227"/>
             <w:tcMar>
               <w:top w:w="0" w:type="dxa"/>
               <w:bottom w:w="0" w:type="dxa"/>
@@ -1960,7 +1960,7 @@
               <w:left w:val="none" w:sz="0" w:space="0" w:color="000000"/>
               <w:right w:val="none" w:sz="0" w:space="0" w:color="000000"/>
             </w:tcBorders>
-            <w:shd w:val="clear" w:color="auto" w:fill="D68690"/>
+            <w:shd w:val="clear" w:color="auto" w:fill="F66E32"/>
             <w:tcMar>
               <w:top w:w="0" w:type="dxa"/>
               <w:bottom w:w="0" w:type="dxa"/>
@@ -2013,7 +2013,7 @@
               <w:left w:val="none" w:sz="0" w:space="0" w:color="000000"/>
               <w:right w:val="none" w:sz="0" w:space="0" w:color="000000"/>
             </w:tcBorders>
-            <w:shd w:val="clear" w:color="auto" w:fill="D17581"/>
+            <w:shd w:val="clear" w:color="auto" w:fill="F35529"/>
             <w:tcMar>
               <w:top w:w="0" w:type="dxa"/>
               <w:bottom w:w="0" w:type="dxa"/>
@@ -2066,7 +2066,7 @@
               <w:left w:val="none" w:sz="0" w:space="0" w:color="000000"/>
               <w:right w:val="none" w:sz="0" w:space="0" w:color="000000"/>
             </w:tcBorders>
-            <w:shd w:val="clear" w:color="auto" w:fill="DC969E"/>
+            <w:shd w:val="clear" w:color="auto" w:fill="F8873C"/>
             <w:tcMar>
               <w:top w:w="0" w:type="dxa"/>
               <w:bottom w:w="0" w:type="dxa"/>
@@ -2172,7 +2172,7 @@
               <w:left w:val="none" w:sz="0" w:space="0" w:color="000000"/>
               <w:right w:val="none" w:sz="0" w:space="0" w:color="000000"/>
             </w:tcBorders>
-            <w:shd w:val="clear" w:color="auto" w:fill="CB6571"/>
+            <w:shd w:val="clear" w:color="auto" w:fill="F03B20"/>
             <w:tcMar>
               <w:top w:w="0" w:type="dxa"/>
               <w:bottom w:w="0" w:type="dxa"/>
@@ -2225,7 +2225,7 @@
               <w:left w:val="none" w:sz="0" w:space="0" w:color="000000"/>
               <w:right w:val="none" w:sz="0" w:space="0" w:color="000000"/>
             </w:tcBorders>
-            <w:shd w:val="clear" w:color="auto" w:fill="D78992"/>
+            <w:shd w:val="clear" w:color="auto" w:fill="F67234"/>
             <w:tcMar>
               <w:top w:w="0" w:type="dxa"/>
               <w:bottom w:w="0" w:type="dxa"/>
@@ -2278,7 +2278,7 @@
               <w:left w:val="none" w:sz="0" w:space="0" w:color="000000"/>
               <w:right w:val="none" w:sz="0" w:space="0" w:color="000000"/>
             </w:tcBorders>
-            <w:shd w:val="clear" w:color="auto" w:fill="E6B5BB"/>
+            <w:shd w:val="clear" w:color="auto" w:fill="FEB44F"/>
             <w:tcMar>
               <w:top w:w="0" w:type="dxa"/>
               <w:bottom w:w="0" w:type="dxa"/>
@@ -2331,7 +2331,7 @@
               <w:left w:val="none" w:sz="0" w:space="0" w:color="000000"/>
               <w:right w:val="none" w:sz="0" w:space="0" w:color="000000"/>
             </w:tcBorders>
-            <w:shd w:val="clear" w:color="auto" w:fill="D98D97"/>
+            <w:shd w:val="clear" w:color="auto" w:fill="F77A37"/>
             <w:tcMar>
               <w:top w:w="0" w:type="dxa"/>
               <w:bottom w:w="0" w:type="dxa"/>
@@ -2384,7 +2384,7 @@
               <w:left w:val="none" w:sz="0" w:space="0" w:color="000000"/>
               <w:right w:val="none" w:sz="0" w:space="0" w:color="000000"/>
             </w:tcBorders>
-            <w:shd w:val="clear" w:color="auto" w:fill="C85A68"/>
+            <w:shd w:val="clear" w:color="auto" w:fill="E73621"/>
             <w:tcMar>
               <w:top w:w="0" w:type="dxa"/>
               <w:bottom w:w="0" w:type="dxa"/>
@@ -2437,7 +2437,7 @@
               <w:left w:val="none" w:sz="0" w:space="0" w:color="000000"/>
               <w:right w:val="none" w:sz="0" w:space="0" w:color="000000"/>
             </w:tcBorders>
-            <w:shd w:val="clear" w:color="auto" w:fill="D4808B"/>
+            <w:shd w:val="clear" w:color="auto" w:fill="F5652F"/>
             <w:tcMar>
               <w:top w:w="0" w:type="dxa"/>
               <w:bottom w:w="0" w:type="dxa"/>
@@ -2490,7 +2490,7 @@
               <w:left w:val="none" w:sz="0" w:space="0" w:color="000000"/>
               <w:right w:val="none" w:sz="0" w:space="0" w:color="000000"/>
             </w:tcBorders>
-            <w:shd w:val="clear" w:color="auto" w:fill="DD9AA2"/>
+            <w:shd w:val="clear" w:color="auto" w:fill="F98D3E"/>
             <w:tcMar>
               <w:top w:w="0" w:type="dxa"/>
               <w:bottom w:w="0" w:type="dxa"/>
@@ -2656,7 +2656,7 @@
               <w:left w:val="none" w:sz="0" w:space="0" w:color="000000"/>
               <w:right w:val="none" w:sz="0" w:space="0" w:color="000000"/>
             </w:tcBorders>
-            <w:shd w:val="clear" w:color="auto" w:fill="E3ACB3"/>
+            <w:shd w:val="clear" w:color="auto" w:fill="FDA948"/>
             <w:tcMar>
               <w:top w:w="0" w:type="dxa"/>
               <w:bottom w:w="0" w:type="dxa"/>
@@ -2709,7 +2709,7 @@
               <w:left w:val="none" w:sz="0" w:space="0" w:color="000000"/>
               <w:right w:val="none" w:sz="0" w:space="0" w:color="000000"/>
             </w:tcBorders>
-            <w:shd w:val="clear" w:color="auto" w:fill="DA9099"/>
+            <w:shd w:val="clear" w:color="auto" w:fill="F77D38"/>
             <w:tcMar>
               <w:top w:w="0" w:type="dxa"/>
               <w:bottom w:w="0" w:type="dxa"/>
@@ -2762,7 +2762,7 @@
               <w:left w:val="none" w:sz="0" w:space="0" w:color="000000"/>
               <w:right w:val="none" w:sz="0" w:space="0" w:color="000000"/>
             </w:tcBorders>
-            <w:shd w:val="clear" w:color="auto" w:fill="EDC9CD"/>
+            <w:shd w:val="clear" w:color="auto" w:fill="FEC365"/>
             <w:tcMar>
               <w:top w:w="0" w:type="dxa"/>
               <w:bottom w:w="0" w:type="dxa"/>
@@ -2815,7 +2815,7 @@
               <w:left w:val="none" w:sz="0" w:space="0" w:color="000000"/>
               <w:right w:val="none" w:sz="0" w:space="0" w:color="000000"/>
             </w:tcBorders>
-            <w:shd w:val="clear" w:color="auto" w:fill="D98D96"/>
+            <w:shd w:val="clear" w:color="auto" w:fill="F77836"/>
             <w:tcMar>
               <w:top w:w="0" w:type="dxa"/>
               <w:bottom w:w="0" w:type="dxa"/>
@@ -2868,7 +2868,7 @@
               <w:left w:val="none" w:sz="0" w:space="0" w:color="000000"/>
               <w:right w:val="none" w:sz="0" w:space="0" w:color="000000"/>
             </w:tcBorders>
-            <w:shd w:val="clear" w:color="auto" w:fill="D78992"/>
+            <w:shd w:val="clear" w:color="auto" w:fill="F67234"/>
             <w:tcMar>
               <w:top w:w="0" w:type="dxa"/>
               <w:bottom w:w="0" w:type="dxa"/>
@@ -2921,7 +2921,7 @@
               <w:left w:val="none" w:sz="0" w:space="0" w:color="000000"/>
               <w:right w:val="none" w:sz="0" w:space="0" w:color="000000"/>
             </w:tcBorders>
-            <w:shd w:val="clear" w:color="auto" w:fill="E3ACB3"/>
+            <w:shd w:val="clear" w:color="auto" w:fill="FDA948"/>
             <w:tcMar>
               <w:top w:w="0" w:type="dxa"/>
               <w:bottom w:w="0" w:type="dxa"/>
@@ -2974,7 +2974,7 @@
               <w:left w:val="none" w:sz="0" w:space="0" w:color="000000"/>
               <w:right w:val="none" w:sz="0" w:space="0" w:color="000000"/>
             </w:tcBorders>
-            <w:shd w:val="clear" w:color="auto" w:fill="EFD0D3"/>
+            <w:shd w:val="clear" w:color="auto" w:fill="FEC96C"/>
             <w:tcMar>
               <w:top w:w="0" w:type="dxa"/>
               <w:bottom w:w="0" w:type="dxa"/>
@@ -3027,7 +3027,7 @@
               <w:left w:val="none" w:sz="0" w:space="0" w:color="000000"/>
               <w:right w:val="none" w:sz="0" w:space="0" w:color="000000"/>
             </w:tcBorders>
-            <w:shd w:val="clear" w:color="auto" w:fill="E0A4AC"/>
+            <w:shd w:val="clear" w:color="auto" w:fill="FB9D44"/>
             <w:tcMar>
               <w:top w:w="0" w:type="dxa"/>
               <w:bottom w:w="0" w:type="dxa"/>
@@ -3080,7 +3080,7 @@
               <w:left w:val="none" w:sz="0" w:space="0" w:color="000000"/>
               <w:right w:val="none" w:sz="0" w:space="0" w:color="000000"/>
             </w:tcBorders>
-            <w:shd w:val="clear" w:color="auto" w:fill="F3DCDF"/>
+            <w:shd w:val="clear" w:color="auto" w:fill="FED27A"/>
             <w:tcMar>
               <w:top w:w="0" w:type="dxa"/>
               <w:bottom w:w="0" w:type="dxa"/>
@@ -3133,7 +3133,7 @@
               <w:left w:val="none" w:sz="0" w:space="0" w:color="000000"/>
               <w:right w:val="none" w:sz="0" w:space="0" w:color="000000"/>
             </w:tcBorders>
-            <w:shd w:val="clear" w:color="auto" w:fill="DFA1A9"/>
+            <w:shd w:val="clear" w:color="auto" w:fill="FB9942"/>
             <w:tcMar>
               <w:top w:w="0" w:type="dxa"/>
               <w:bottom w:w="0" w:type="dxa"/>
@@ -3186,7 +3186,7 @@
               <w:left w:val="none" w:sz="0" w:space="0" w:color="000000"/>
               <w:right w:val="none" w:sz="0" w:space="0" w:color="000000"/>
             </w:tcBorders>
-            <w:shd w:val="clear" w:color="auto" w:fill="F1D5D8"/>
+            <w:shd w:val="clear" w:color="auto" w:fill="FECD72"/>
             <w:tcMar>
               <w:top w:w="0" w:type="dxa"/>
               <w:bottom w:w="0" w:type="dxa"/>
@@ -3340,7 +3340,7 @@
               <w:left w:val="none" w:sz="0" w:space="0" w:color="000000"/>
               <w:right w:val="none" w:sz="0" w:space="0" w:color="000000"/>
             </w:tcBorders>
-            <w:shd w:val="clear" w:color="auto" w:fill="EAC0C5"/>
+            <w:shd w:val="clear" w:color="auto" w:fill="FEBD5B"/>
             <w:tcMar>
               <w:top w:w="0" w:type="dxa"/>
               <w:bottom w:w="0" w:type="dxa"/>
@@ -3393,7 +3393,7 @@
               <w:left w:val="none" w:sz="0" w:space="0" w:color="000000"/>
               <w:right w:val="none" w:sz="0" w:space="0" w:color="000000"/>
             </w:tcBorders>
-            <w:shd w:val="clear" w:color="auto" w:fill="DD99A1"/>
+            <w:shd w:val="clear" w:color="auto" w:fill="F98B3D"/>
             <w:tcMar>
               <w:top w:w="0" w:type="dxa"/>
               <w:bottom w:w="0" w:type="dxa"/>
@@ -3446,7 +3446,7 @@
               <w:left w:val="none" w:sz="0" w:space="0" w:color="000000"/>
               <w:right w:val="none" w:sz="0" w:space="0" w:color="000000"/>
             </w:tcBorders>
-            <w:shd w:val="clear" w:color="auto" w:fill="F7E7E9"/>
+            <w:shd w:val="clear" w:color="auto" w:fill="FEDA85"/>
             <w:tcMar>
               <w:top w:w="0" w:type="dxa"/>
               <w:bottom w:w="0" w:type="dxa"/>
@@ -3499,7 +3499,7 @@
               <w:left w:val="none" w:sz="0" w:space="0" w:color="000000"/>
               <w:right w:val="none" w:sz="0" w:space="0" w:color="000000"/>
             </w:tcBorders>
-            <w:shd w:val="clear" w:color="auto" w:fill="E9BFC5"/>
+            <w:shd w:val="clear" w:color="auto" w:fill="FEBC5B"/>
             <w:tcMar>
               <w:top w:w="0" w:type="dxa"/>
               <w:bottom w:w="0" w:type="dxa"/>
@@ -3552,7 +3552,7 @@
               <w:left w:val="none" w:sz="0" w:space="0" w:color="000000"/>
               <w:right w:val="none" w:sz="0" w:space="0" w:color="000000"/>
             </w:tcBorders>
-            <w:shd w:val="clear" w:color="auto" w:fill="E5B2B8"/>
+            <w:shd w:val="clear" w:color="auto" w:fill="FEB24C"/>
             <w:tcMar>
               <w:top w:w="0" w:type="dxa"/>
               <w:bottom w:w="0" w:type="dxa"/>
@@ -3605,7 +3605,7 @@
               <w:left w:val="none" w:sz="0" w:space="0" w:color="000000"/>
               <w:right w:val="none" w:sz="0" w:space="0" w:color="000000"/>
             </w:tcBorders>
-            <w:shd w:val="clear" w:color="auto" w:fill="EAC1C6"/>
+            <w:shd w:val="clear" w:color="auto" w:fill="FEBD5C"/>
             <w:tcMar>
               <w:top w:w="0" w:type="dxa"/>
               <w:bottom w:w="0" w:type="dxa"/>
@@ -3658,7 +3658,7 @@
               <w:left w:val="none" w:sz="0" w:space="0" w:color="000000"/>
               <w:right w:val="none" w:sz="0" w:space="0" w:color="000000"/>
             </w:tcBorders>
-            <w:shd w:val="clear" w:color="auto" w:fill="EECCD0"/>
+            <w:shd w:val="clear" w:color="auto" w:fill="FEC668"/>
             <w:tcMar>
               <w:top w:w="0" w:type="dxa"/>
               <w:bottom w:w="0" w:type="dxa"/>
@@ -3711,7 +3711,7 @@
               <w:left w:val="none" w:sz="0" w:space="0" w:color="000000"/>
               <w:right w:val="none" w:sz="0" w:space="0" w:color="000000"/>
             </w:tcBorders>
-            <w:shd w:val="clear" w:color="auto" w:fill="E9BDC2"/>
+            <w:shd w:val="clear" w:color="auto" w:fill="FEBA58"/>
             <w:tcMar>
               <w:top w:w="0" w:type="dxa"/>
               <w:bottom w:w="0" w:type="dxa"/>
@@ -3764,7 +3764,7 @@
               <w:left w:val="none" w:sz="0" w:space="0" w:color="000000"/>
               <w:right w:val="none" w:sz="0" w:space="0" w:color="000000"/>
             </w:tcBorders>
-            <w:shd w:val="clear" w:color="auto" w:fill="F0D3D7"/>
+            <w:shd w:val="clear" w:color="auto" w:fill="FECB70"/>
             <w:tcMar>
               <w:top w:w="0" w:type="dxa"/>
               <w:bottom w:w="0" w:type="dxa"/>
@@ -3817,7 +3817,7 @@
               <w:left w:val="none" w:sz="0" w:space="0" w:color="000000"/>
               <w:right w:val="none" w:sz="0" w:space="0" w:color="000000"/>
             </w:tcBorders>
-            <w:shd w:val="clear" w:color="auto" w:fill="E7B9BF"/>
+            <w:shd w:val="clear" w:color="auto" w:fill="FEB754"/>
             <w:tcMar>
               <w:top w:w="0" w:type="dxa"/>
               <w:bottom w:w="0" w:type="dxa"/>
@@ -3870,7 +3870,7 @@
               <w:left w:val="none" w:sz="0" w:space="0" w:color="000000"/>
               <w:right w:val="none" w:sz="0" w:space="0" w:color="000000"/>
             </w:tcBorders>
-            <w:shd w:val="clear" w:color="auto" w:fill="F3DBDE"/>
+            <w:shd w:val="clear" w:color="auto" w:fill="FED179"/>
             <w:tcMar>
               <w:top w:w="0" w:type="dxa"/>
               <w:bottom w:w="0" w:type="dxa"/>
@@ -4036,7 +4036,60 @@
               <w:left w:val="none" w:sz="0" w:space="0" w:color="000000"/>
               <w:right w:val="none" w:sz="0" w:space="0" w:color="000000"/>
             </w:tcBorders>
-            <w:shd w:val="clear" w:color="auto" w:fill="CC6875"/>
+            <w:shd w:val="clear" w:color="auto" w:fill="F04022"/>
+            <w:tcMar>
+              <w:top w:w="0" w:type="dxa"/>
+              <w:bottom w:w="0" w:type="dxa"/>
+              <w:left w:w="0" w:type="dxa"/>
+              <w:right w:w="0" w:type="dxa"/>
+            </w:tcMar>
+            <w:vAlign w:val="center"/>
+          </w:tcPr>
+          <w:p>
+            <w:pPr>
+              <w:pStyle w:val="Normal"/>
+              <w:jc w:val="center"/>
+              <w:pBdr>
+                <w:bottom w:val="none" w:sz="0" w:space="0" w:color="000000"/>
+                <w:top w:val="none" w:sz="0" w:space="0" w:color="000000"/>
+                <w:left w:val="none" w:sz="0" w:space="0" w:color="000000"/>
+                <w:right w:val="none" w:sz="0" w:space="0" w:color="000000"/>
+              </w:pBdr>
+              <w:spacing w:after="100" w:before="100" w:line="240"/>
+              <w:ind w:left="100" w:right="100" w:firstLine="0" w:firstLineChars="0"/>
+              <w:rPr>
+                <w:rFonts w:ascii="Helvetica" w:hAnsi="Helvetica" w:eastAsia="Helvetica" w:cs="Helvetica"/>
+                <w:i w:val="false"/>
+                <w:b w:val="false"/>
+                <w:u w:val="none"/>
+                <w:sz w:val="18"/>
+                <w:szCs w:val="18"/>
+                <w:color w:val="000000"/>
+              </w:rPr>
+            </w:pPr>
+            <w:r>
+              <w:rPr>
+                <w:rFonts w:ascii="Helvetica" w:hAnsi="Helvetica" w:eastAsia="Helvetica" w:cs="Helvetica"/>
+                <w:i w:val="false"/>
+                <w:b w:val="false"/>
+                <w:u w:val="none"/>
+                <w:sz w:val="18"/>
+                <w:szCs w:val="18"/>
+                <w:color w:val="000000"/>
+              </w:rPr>
+              <w:t xml:space="preserve">19.5</w:t>
+            </w:r>
+          </w:p>
+        </w:tc>
+        <w:tc>
+          <w:tcPr>
+            <w:tcBorders>
+              <w:bottom w:val="none" w:sz="0" w:space="0" w:color="000000"/>
+              <w:top w:val="none" w:sz="0" w:space="0" w:color="000000"/>
+              <w:left w:val="none" w:sz="0" w:space="0" w:color="000000"/>
+              <w:right w:val="none" w:sz="0" w:space="0" w:color="000000"/>
+            </w:tcBorders>
+            <w:shd w:val="clear" w:color="auto" w:fill="D22A25"/>
             <w:tcMar>
               <w:top w:w="0" w:type="dxa"/>
               <w:bottom w:w="0" w:type="dxa"/>
@@ -4077,19 +4130,72 @@
                 <w:szCs w:val="18"/>
                 <w:color w:val="FFFFFF"/>
               </w:rPr>
-              <w:t xml:space="preserve">19.5</w:t>
-            </w:r>
-          </w:p>
-        </w:tc>
-        <w:tc>
-          <w:tcPr>
-            <w:tcBorders>
-              <w:bottom w:val="none" w:sz="0" w:space="0" w:color="000000"/>
-              <w:top w:val="none" w:sz="0" w:space="0" w:color="000000"/>
-              <w:left w:val="none" w:sz="0" w:space="0" w:color="000000"/>
-              <w:right w:val="none" w:sz="0" w:space="0" w:color="000000"/>
-            </w:tcBorders>
-            <w:shd w:val="clear" w:color="auto" w:fill="BF404F"/>
+              <w:t xml:space="preserve">24.8</w:t>
+            </w:r>
+          </w:p>
+        </w:tc>
+        <w:tc>
+          <w:tcPr>
+            <w:tcBorders>
+              <w:bottom w:val="none" w:sz="0" w:space="0" w:color="000000"/>
+              <w:top w:val="none" w:sz="0" w:space="0" w:color="000000"/>
+              <w:left w:val="none" w:sz="0" w:space="0" w:color="000000"/>
+              <w:right w:val="none" w:sz="0" w:space="0" w:color="000000"/>
+            </w:tcBorders>
+            <w:shd w:val="clear" w:color="auto" w:fill="F77D38"/>
+            <w:tcMar>
+              <w:top w:w="0" w:type="dxa"/>
+              <w:bottom w:w="0" w:type="dxa"/>
+              <w:left w:w="0" w:type="dxa"/>
+              <w:right w:w="0" w:type="dxa"/>
+            </w:tcMar>
+            <w:vAlign w:val="center"/>
+          </w:tcPr>
+          <w:p>
+            <w:pPr>
+              <w:pStyle w:val="Normal"/>
+              <w:jc w:val="center"/>
+              <w:pBdr>
+                <w:bottom w:val="none" w:sz="0" w:space="0" w:color="000000"/>
+                <w:top w:val="none" w:sz="0" w:space="0" w:color="000000"/>
+                <w:left w:val="none" w:sz="0" w:space="0" w:color="000000"/>
+                <w:right w:val="none" w:sz="0" w:space="0" w:color="000000"/>
+              </w:pBdr>
+              <w:spacing w:after="100" w:before="100" w:line="240"/>
+              <w:ind w:left="100" w:right="100" w:firstLine="0" w:firstLineChars="0"/>
+              <w:rPr>
+                <w:rFonts w:ascii="Helvetica" w:hAnsi="Helvetica" w:eastAsia="Helvetica" w:cs="Helvetica"/>
+                <w:i w:val="false"/>
+                <w:b w:val="false"/>
+                <w:u w:val="none"/>
+                <w:sz w:val="18"/>
+                <w:szCs w:val="18"/>
+                <w:color w:val="000000"/>
+              </w:rPr>
+            </w:pPr>
+            <w:r>
+              <w:rPr>
+                <w:rFonts w:ascii="Helvetica" w:hAnsi="Helvetica" w:eastAsia="Helvetica" w:cs="Helvetica"/>
+                <w:i w:val="false"/>
+                <w:b w:val="false"/>
+                <w:u w:val="none"/>
+                <w:sz w:val="18"/>
+                <w:szCs w:val="18"/>
+                <w:color w:val="000000"/>
+              </w:rPr>
+              <w:t xml:space="preserve">14.4</w:t>
+            </w:r>
+          </w:p>
+        </w:tc>
+        <w:tc>
+          <w:tcPr>
+            <w:tcBorders>
+              <w:bottom w:val="none" w:sz="0" w:space="0" w:color="000000"/>
+              <w:top w:val="none" w:sz="0" w:space="0" w:color="000000"/>
+              <w:left w:val="none" w:sz="0" w:space="0" w:color="000000"/>
+              <w:right w:val="none" w:sz="0" w:space="0" w:color="000000"/>
+            </w:tcBorders>
+            <w:shd w:val="clear" w:color="auto" w:fill="B2182B"/>
             <w:tcMar>
               <w:top w:w="0" w:type="dxa"/>
               <w:bottom w:w="0" w:type="dxa"/>
@@ -4130,72 +4236,19 @@
                 <w:szCs w:val="18"/>
                 <w:color w:val="FFFFFF"/>
               </w:rPr>
-              <w:t xml:space="preserve">24.8</w:t>
-            </w:r>
-          </w:p>
-        </w:tc>
-        <w:tc>
-          <w:tcPr>
-            <w:tcBorders>
-              <w:bottom w:val="none" w:sz="0" w:space="0" w:color="000000"/>
-              <w:top w:val="none" w:sz="0" w:space="0" w:color="000000"/>
-              <w:left w:val="none" w:sz="0" w:space="0" w:color="000000"/>
-              <w:right w:val="none" w:sz="0" w:space="0" w:color="000000"/>
-            </w:tcBorders>
-            <w:shd w:val="clear" w:color="auto" w:fill="DA9099"/>
-            <w:tcMar>
-              <w:top w:w="0" w:type="dxa"/>
-              <w:bottom w:w="0" w:type="dxa"/>
-              <w:left w:w="0" w:type="dxa"/>
-              <w:right w:w="0" w:type="dxa"/>
-            </w:tcMar>
-            <w:vAlign w:val="center"/>
-          </w:tcPr>
-          <w:p>
-            <w:pPr>
-              <w:pStyle w:val="Normal"/>
-              <w:jc w:val="center"/>
-              <w:pBdr>
-                <w:bottom w:val="none" w:sz="0" w:space="0" w:color="000000"/>
-                <w:top w:val="none" w:sz="0" w:space="0" w:color="000000"/>
-                <w:left w:val="none" w:sz="0" w:space="0" w:color="000000"/>
-                <w:right w:val="none" w:sz="0" w:space="0" w:color="000000"/>
-              </w:pBdr>
-              <w:spacing w:after="100" w:before="100" w:line="240"/>
-              <w:ind w:left="100" w:right="100" w:firstLine="0" w:firstLineChars="0"/>
-              <w:rPr>
-                <w:rFonts w:ascii="Helvetica" w:hAnsi="Helvetica" w:eastAsia="Helvetica" w:cs="Helvetica"/>
-                <w:i w:val="false"/>
-                <w:b w:val="false"/>
-                <w:u w:val="none"/>
-                <w:sz w:val="18"/>
-                <w:szCs w:val="18"/>
-                <w:color w:val="000000"/>
-              </w:rPr>
-            </w:pPr>
-            <w:r>
-              <w:rPr>
-                <w:rFonts w:ascii="Helvetica" w:hAnsi="Helvetica" w:eastAsia="Helvetica" w:cs="Helvetica"/>
-                <w:i w:val="false"/>
-                <w:b w:val="false"/>
-                <w:u w:val="none"/>
-                <w:sz w:val="18"/>
-                <w:szCs w:val="18"/>
-                <w:color w:val="000000"/>
-              </w:rPr>
-              <w:t xml:space="preserve">14.4</w:t>
-            </w:r>
-          </w:p>
-        </w:tc>
-        <w:tc>
-          <w:tcPr>
-            <w:tcBorders>
-              <w:bottom w:val="none" w:sz="0" w:space="0" w:color="000000"/>
-              <w:top w:val="none" w:sz="0" w:space="0" w:color="000000"/>
-              <w:left w:val="none" w:sz="0" w:space="0" w:color="000000"/>
-              <w:right w:val="none" w:sz="0" w:space="0" w:color="000000"/>
-            </w:tcBorders>
-            <w:shd w:val="clear" w:color="auto" w:fill="B2182B"/>
+              <w:t xml:space="preserve">37.7</w:t>
+            </w:r>
+          </w:p>
+        </w:tc>
+        <w:tc>
+          <w:tcPr>
+            <w:tcBorders>
+              <w:bottom w:val="none" w:sz="0" w:space="0" w:color="000000"/>
+              <w:top w:val="none" w:sz="0" w:space="0" w:color="000000"/>
+              <w:left w:val="none" w:sz="0" w:space="0" w:color="000000"/>
+              <w:right w:val="none" w:sz="0" w:space="0" w:color="000000"/>
+            </w:tcBorders>
+            <w:shd w:val="clear" w:color="auto" w:fill="C42227"/>
             <w:tcMar>
               <w:top w:w="0" w:type="dxa"/>
               <w:bottom w:w="0" w:type="dxa"/>
@@ -4236,19 +4289,125 @@
                 <w:szCs w:val="18"/>
                 <w:color w:val="FFFFFF"/>
               </w:rPr>
-              <w:t xml:space="preserve">37.7</w:t>
-            </w:r>
-          </w:p>
-        </w:tc>
-        <w:tc>
-          <w:tcPr>
-            <w:tcBorders>
-              <w:bottom w:val="none" w:sz="0" w:space="0" w:color="000000"/>
-              <w:top w:val="none" w:sz="0" w:space="0" w:color="000000"/>
-              <w:left w:val="none" w:sz="0" w:space="0" w:color="000000"/>
-              <w:right w:val="none" w:sz="0" w:space="0" w:color="000000"/>
-            </w:tcBorders>
-            <w:shd w:val="clear" w:color="auto" w:fill="B92F40"/>
+              <w:t xml:space="preserve">27.0</w:t>
+            </w:r>
+          </w:p>
+        </w:tc>
+        <w:tc>
+          <w:tcPr>
+            <w:tcBorders>
+              <w:bottom w:val="none" w:sz="0" w:space="0" w:color="000000"/>
+              <w:top w:val="none" w:sz="0" w:space="0" w:color="000000"/>
+              <w:left w:val="none" w:sz="0" w:space="0" w:color="000000"/>
+              <w:right w:val="none" w:sz="0" w:space="0" w:color="000000"/>
+            </w:tcBorders>
+            <w:shd w:val="clear" w:color="auto" w:fill="F3572A"/>
+            <w:tcMar>
+              <w:top w:w="0" w:type="dxa"/>
+              <w:bottom w:w="0" w:type="dxa"/>
+              <w:left w:w="0" w:type="dxa"/>
+              <w:right w:w="0" w:type="dxa"/>
+            </w:tcMar>
+            <w:vAlign w:val="center"/>
+          </w:tcPr>
+          <w:p>
+            <w:pPr>
+              <w:pStyle w:val="Normal"/>
+              <w:jc w:val="center"/>
+              <w:pBdr>
+                <w:bottom w:val="none" w:sz="0" w:space="0" w:color="000000"/>
+                <w:top w:val="none" w:sz="0" w:space="0" w:color="000000"/>
+                <w:left w:val="none" w:sz="0" w:space="0" w:color="000000"/>
+                <w:right w:val="none" w:sz="0" w:space="0" w:color="000000"/>
+              </w:pBdr>
+              <w:spacing w:after="100" w:before="100" w:line="240"/>
+              <w:ind w:left="100" w:right="100" w:firstLine="0" w:firstLineChars="0"/>
+              <w:rPr>
+                <w:rFonts w:ascii="Helvetica" w:hAnsi="Helvetica" w:eastAsia="Helvetica" w:cs="Helvetica"/>
+                <w:i w:val="false"/>
+                <w:b w:val="false"/>
+                <w:u w:val="none"/>
+                <w:sz w:val="18"/>
+                <w:szCs w:val="18"/>
+                <w:color w:val="000000"/>
+              </w:rPr>
+            </w:pPr>
+            <w:r>
+              <w:rPr>
+                <w:rFonts w:ascii="Helvetica" w:hAnsi="Helvetica" w:eastAsia="Helvetica" w:cs="Helvetica"/>
+                <w:i w:val="false"/>
+                <w:b w:val="false"/>
+                <w:u w:val="none"/>
+                <w:sz w:val="18"/>
+                <w:szCs w:val="18"/>
+                <w:color w:val="000000"/>
+              </w:rPr>
+              <w:t xml:space="preserve">17.6</w:t>
+            </w:r>
+          </w:p>
+        </w:tc>
+        <w:tc>
+          <w:tcPr>
+            <w:tcBorders>
+              <w:bottom w:val="none" w:sz="0" w:space="0" w:color="000000"/>
+              <w:top w:val="none" w:sz="0" w:space="0" w:color="000000"/>
+              <w:left w:val="none" w:sz="0" w:space="0" w:color="000000"/>
+              <w:right w:val="none" w:sz="0" w:space="0" w:color="000000"/>
+            </w:tcBorders>
+            <w:shd w:val="clear" w:color="auto" w:fill="FA9140"/>
+            <w:tcMar>
+              <w:top w:w="0" w:type="dxa"/>
+              <w:bottom w:w="0" w:type="dxa"/>
+              <w:left w:w="0" w:type="dxa"/>
+              <w:right w:w="0" w:type="dxa"/>
+            </w:tcMar>
+            <w:vAlign w:val="center"/>
+          </w:tcPr>
+          <w:p>
+            <w:pPr>
+              <w:pStyle w:val="Normal"/>
+              <w:jc w:val="center"/>
+              <w:pBdr>
+                <w:bottom w:val="none" w:sz="0" w:space="0" w:color="000000"/>
+                <w:top w:val="none" w:sz="0" w:space="0" w:color="000000"/>
+                <w:left w:val="none" w:sz="0" w:space="0" w:color="000000"/>
+                <w:right w:val="none" w:sz="0" w:space="0" w:color="000000"/>
+              </w:pBdr>
+              <w:spacing w:after="100" w:before="100" w:line="240"/>
+              <w:ind w:left="100" w:right="100" w:firstLine="0" w:firstLineChars="0"/>
+              <w:rPr>
+                <w:rFonts w:ascii="Helvetica" w:hAnsi="Helvetica" w:eastAsia="Helvetica" w:cs="Helvetica"/>
+                <w:i w:val="false"/>
+                <w:b w:val="false"/>
+                <w:u w:val="none"/>
+                <w:sz w:val="18"/>
+                <w:szCs w:val="18"/>
+                <w:color w:val="000000"/>
+              </w:rPr>
+            </w:pPr>
+            <w:r>
+              <w:rPr>
+                <w:rFonts w:ascii="Helvetica" w:hAnsi="Helvetica" w:eastAsia="Helvetica" w:cs="Helvetica"/>
+                <w:i w:val="false"/>
+                <w:b w:val="false"/>
+                <w:u w:val="none"/>
+                <w:sz w:val="18"/>
+                <w:szCs w:val="18"/>
+                <w:color w:val="000000"/>
+              </w:rPr>
+              <w:t xml:space="preserve">12.7</w:t>
+            </w:r>
+          </w:p>
+        </w:tc>
+        <w:tc>
+          <w:tcPr>
+            <w:tcBorders>
+              <w:bottom w:val="none" w:sz="0" w:space="0" w:color="000000"/>
+              <w:top w:val="none" w:sz="0" w:space="0" w:color="000000"/>
+              <w:left w:val="none" w:sz="0" w:space="0" w:color="000000"/>
+              <w:right w:val="none" w:sz="0" w:space="0" w:color="000000"/>
+            </w:tcBorders>
+            <w:shd w:val="clear" w:color="auto" w:fill="EC3920"/>
             <w:tcMar>
               <w:top w:w="0" w:type="dxa"/>
               <w:bottom w:w="0" w:type="dxa"/>
@@ -4289,165 +4448,6 @@
                 <w:szCs w:val="18"/>
                 <w:color w:val="FFFFFF"/>
               </w:rPr>
-              <w:t xml:space="preserve">27.0</w:t>
-            </w:r>
-          </w:p>
-        </w:tc>
-        <w:tc>
-          <w:tcPr>
-            <w:tcBorders>
-              <w:bottom w:val="none" w:sz="0" w:space="0" w:color="000000"/>
-              <w:top w:val="none" w:sz="0" w:space="0" w:color="000000"/>
-              <w:left w:val="none" w:sz="0" w:space="0" w:color="000000"/>
-              <w:right w:val="none" w:sz="0" w:space="0" w:color="000000"/>
-            </w:tcBorders>
-            <w:shd w:val="clear" w:color="auto" w:fill="D17782"/>
-            <w:tcMar>
-              <w:top w:w="0" w:type="dxa"/>
-              <w:bottom w:w="0" w:type="dxa"/>
-              <w:left w:w="0" w:type="dxa"/>
-              <w:right w:w="0" w:type="dxa"/>
-            </w:tcMar>
-            <w:vAlign w:val="center"/>
-          </w:tcPr>
-          <w:p>
-            <w:pPr>
-              <w:pStyle w:val="Normal"/>
-              <w:jc w:val="center"/>
-              <w:pBdr>
-                <w:bottom w:val="none" w:sz="0" w:space="0" w:color="000000"/>
-                <w:top w:val="none" w:sz="0" w:space="0" w:color="000000"/>
-                <w:left w:val="none" w:sz="0" w:space="0" w:color="000000"/>
-                <w:right w:val="none" w:sz="0" w:space="0" w:color="000000"/>
-              </w:pBdr>
-              <w:spacing w:after="100" w:before="100" w:line="240"/>
-              <w:ind w:left="100" w:right="100" w:firstLine="0" w:firstLineChars="0"/>
-              <w:rPr>
-                <w:rFonts w:ascii="Helvetica" w:hAnsi="Helvetica" w:eastAsia="Helvetica" w:cs="Helvetica"/>
-                <w:i w:val="false"/>
-                <w:b w:val="false"/>
-                <w:u w:val="none"/>
-                <w:sz w:val="18"/>
-                <w:szCs w:val="18"/>
-                <w:color w:val="000000"/>
-              </w:rPr>
-            </w:pPr>
-            <w:r>
-              <w:rPr>
-                <w:rFonts w:ascii="Helvetica" w:hAnsi="Helvetica" w:eastAsia="Helvetica" w:cs="Helvetica"/>
-                <w:i w:val="false"/>
-                <w:b w:val="false"/>
-                <w:u w:val="none"/>
-                <w:sz w:val="18"/>
-                <w:szCs w:val="18"/>
-                <w:color w:val="000000"/>
-              </w:rPr>
-              <w:t xml:space="preserve">17.6</w:t>
-            </w:r>
-          </w:p>
-        </w:tc>
-        <w:tc>
-          <w:tcPr>
-            <w:tcBorders>
-              <w:bottom w:val="none" w:sz="0" w:space="0" w:color="000000"/>
-              <w:top w:val="none" w:sz="0" w:space="0" w:color="000000"/>
-              <w:left w:val="none" w:sz="0" w:space="0" w:color="000000"/>
-              <w:right w:val="none" w:sz="0" w:space="0" w:color="000000"/>
-            </w:tcBorders>
-            <w:shd w:val="clear" w:color="auto" w:fill="DE9DA5"/>
-            <w:tcMar>
-              <w:top w:w="0" w:type="dxa"/>
-              <w:bottom w:w="0" w:type="dxa"/>
-              <w:left w:w="0" w:type="dxa"/>
-              <w:right w:w="0" w:type="dxa"/>
-            </w:tcMar>
-            <w:vAlign w:val="center"/>
-          </w:tcPr>
-          <w:p>
-            <w:pPr>
-              <w:pStyle w:val="Normal"/>
-              <w:jc w:val="center"/>
-              <w:pBdr>
-                <w:bottom w:val="none" w:sz="0" w:space="0" w:color="000000"/>
-                <w:top w:val="none" w:sz="0" w:space="0" w:color="000000"/>
-                <w:left w:val="none" w:sz="0" w:space="0" w:color="000000"/>
-                <w:right w:val="none" w:sz="0" w:space="0" w:color="000000"/>
-              </w:pBdr>
-              <w:spacing w:after="100" w:before="100" w:line="240"/>
-              <w:ind w:left="100" w:right="100" w:firstLine="0" w:firstLineChars="0"/>
-              <w:rPr>
-                <w:rFonts w:ascii="Helvetica" w:hAnsi="Helvetica" w:eastAsia="Helvetica" w:cs="Helvetica"/>
-                <w:i w:val="false"/>
-                <w:b w:val="false"/>
-                <w:u w:val="none"/>
-                <w:sz w:val="18"/>
-                <w:szCs w:val="18"/>
-                <w:color w:val="000000"/>
-              </w:rPr>
-            </w:pPr>
-            <w:r>
-              <w:rPr>
-                <w:rFonts w:ascii="Helvetica" w:hAnsi="Helvetica" w:eastAsia="Helvetica" w:cs="Helvetica"/>
-                <w:i w:val="false"/>
-                <w:b w:val="false"/>
-                <w:u w:val="none"/>
-                <w:sz w:val="18"/>
-                <w:szCs w:val="18"/>
-                <w:color w:val="000000"/>
-              </w:rPr>
-              <w:t xml:space="preserve">12.7</w:t>
-            </w:r>
-          </w:p>
-        </w:tc>
-        <w:tc>
-          <w:tcPr>
-            <w:tcBorders>
-              <w:bottom w:val="none" w:sz="0" w:space="0" w:color="000000"/>
-              <w:top w:val="none" w:sz="0" w:space="0" w:color="000000"/>
-              <w:left w:val="none" w:sz="0" w:space="0" w:color="000000"/>
-              <w:right w:val="none" w:sz="0" w:space="0" w:color="000000"/>
-            </w:tcBorders>
-            <w:shd w:val="clear" w:color="auto" w:fill="CA616E"/>
-            <w:tcMar>
-              <w:top w:w="0" w:type="dxa"/>
-              <w:bottom w:w="0" w:type="dxa"/>
-              <w:left w:w="0" w:type="dxa"/>
-              <w:right w:w="0" w:type="dxa"/>
-            </w:tcMar>
-            <w:vAlign w:val="center"/>
-          </w:tcPr>
-          <w:p>
-            <w:pPr>
-              <w:pStyle w:val="Normal"/>
-              <w:jc w:val="center"/>
-              <w:pBdr>
-                <w:bottom w:val="none" w:sz="0" w:space="0" w:color="000000"/>
-                <w:top w:val="none" w:sz="0" w:space="0" w:color="000000"/>
-                <w:left w:val="none" w:sz="0" w:space="0" w:color="000000"/>
-                <w:right w:val="none" w:sz="0" w:space="0" w:color="000000"/>
-              </w:pBdr>
-              <w:spacing w:after="100" w:before="100" w:line="240"/>
-              <w:ind w:left="100" w:right="100" w:firstLine="0" w:firstLineChars="0"/>
-              <w:rPr>
-                <w:rFonts w:ascii="Helvetica" w:hAnsi="Helvetica" w:eastAsia="Helvetica" w:cs="Helvetica"/>
-                <w:i w:val="false"/>
-                <w:b w:val="false"/>
-                <w:u w:val="none"/>
-                <w:sz w:val="18"/>
-                <w:szCs w:val="18"/>
-                <w:color w:val="FFFFFF"/>
-              </w:rPr>
-            </w:pPr>
-            <w:r>
-              <w:rPr>
-                <w:rFonts w:ascii="Helvetica" w:hAnsi="Helvetica" w:eastAsia="Helvetica" w:cs="Helvetica"/>
-                <w:i w:val="false"/>
-                <w:b w:val="false"/>
-                <w:u w:val="none"/>
-                <w:sz w:val="18"/>
-                <w:szCs w:val="18"/>
-                <w:color w:val="FFFFFF"/>
-              </w:rPr>
               <w:t xml:space="preserve">20.5</w:t>
             </w:r>
           </w:p>
@@ -4460,7 +4460,7 @@
               <w:left w:val="none" w:sz="0" w:space="0" w:color="000000"/>
               <w:right w:val="none" w:sz="0" w:space="0" w:color="000000"/>
             </w:tcBorders>
-            <w:shd w:val="clear" w:color="auto" w:fill="DC979F"/>
+            <w:shd w:val="clear" w:color="auto" w:fill="F9883C"/>
             <w:tcMar>
               <w:top w:w="0" w:type="dxa"/>
               <w:bottom w:w="0" w:type="dxa"/>
@@ -4513,46 +4513,46 @@
               <w:left w:val="none" w:sz="0" w:space="0" w:color="000000"/>
               <w:right w:val="none" w:sz="0" w:space="0" w:color="000000"/>
             </w:tcBorders>
-            <w:shd w:val="clear" w:color="auto" w:fill="CC6673"/>
-            <w:tcMar>
-              <w:top w:w="0" w:type="dxa"/>
-              <w:bottom w:w="0" w:type="dxa"/>
-              <w:left w:w="0" w:type="dxa"/>
-              <w:right w:w="0" w:type="dxa"/>
-            </w:tcMar>
-            <w:vAlign w:val="center"/>
-          </w:tcPr>
-          <w:p>
-            <w:pPr>
-              <w:pStyle w:val="Normal"/>
-              <w:jc w:val="center"/>
-              <w:pBdr>
-                <w:bottom w:val="none" w:sz="0" w:space="0" w:color="000000"/>
-                <w:top w:val="none" w:sz="0" w:space="0" w:color="000000"/>
-                <w:left w:val="none" w:sz="0" w:space="0" w:color="000000"/>
-                <w:right w:val="none" w:sz="0" w:space="0" w:color="000000"/>
-              </w:pBdr>
-              <w:spacing w:after="100" w:before="100" w:line="240"/>
-              <w:ind w:left="100" w:right="100" w:firstLine="0" w:firstLineChars="0"/>
-              <w:rPr>
-                <w:rFonts w:ascii="Helvetica" w:hAnsi="Helvetica" w:eastAsia="Helvetica" w:cs="Helvetica"/>
-                <w:i w:val="false"/>
-                <w:b w:val="false"/>
-                <w:u w:val="none"/>
-                <w:sz w:val="18"/>
-                <w:szCs w:val="18"/>
-                <w:color w:val="FFFFFF"/>
-              </w:rPr>
-            </w:pPr>
-            <w:r>
-              <w:rPr>
-                <w:rFonts w:ascii="Helvetica" w:hAnsi="Helvetica" w:eastAsia="Helvetica" w:cs="Helvetica"/>
-                <w:i w:val="false"/>
-                <w:b w:val="false"/>
-                <w:u w:val="none"/>
-                <w:sz w:val="18"/>
-                <w:szCs w:val="18"/>
-                <w:color w:val="FFFFFF"/>
+            <w:shd w:val="clear" w:color="auto" w:fill="F03D20"/>
+            <w:tcMar>
+              <w:top w:w="0" w:type="dxa"/>
+              <w:bottom w:w="0" w:type="dxa"/>
+              <w:left w:w="0" w:type="dxa"/>
+              <w:right w:w="0" w:type="dxa"/>
+            </w:tcMar>
+            <w:vAlign w:val="center"/>
+          </w:tcPr>
+          <w:p>
+            <w:pPr>
+              <w:pStyle w:val="Normal"/>
+              <w:jc w:val="center"/>
+              <w:pBdr>
+                <w:bottom w:val="none" w:sz="0" w:space="0" w:color="000000"/>
+                <w:top w:val="none" w:sz="0" w:space="0" w:color="000000"/>
+                <w:left w:val="none" w:sz="0" w:space="0" w:color="000000"/>
+                <w:right w:val="none" w:sz="0" w:space="0" w:color="000000"/>
+              </w:pBdr>
+              <w:spacing w:after="100" w:before="100" w:line="240"/>
+              <w:ind w:left="100" w:right="100" w:firstLine="0" w:firstLineChars="0"/>
+              <w:rPr>
+                <w:rFonts w:ascii="Helvetica" w:hAnsi="Helvetica" w:eastAsia="Helvetica" w:cs="Helvetica"/>
+                <w:i w:val="false"/>
+                <w:b w:val="false"/>
+                <w:u w:val="none"/>
+                <w:sz w:val="18"/>
+                <w:szCs w:val="18"/>
+                <w:color w:val="000000"/>
+              </w:rPr>
+            </w:pPr>
+            <w:r>
+              <w:rPr>
+                <w:rFonts w:ascii="Helvetica" w:hAnsi="Helvetica" w:eastAsia="Helvetica" w:cs="Helvetica"/>
+                <w:i w:val="false"/>
+                <w:b w:val="false"/>
+                <w:u w:val="none"/>
+                <w:sz w:val="18"/>
+                <w:szCs w:val="18"/>
+                <w:color w:val="000000"/>
               </w:rPr>
               <w:t xml:space="preserve">19.8</w:t>
             </w:r>
@@ -4566,46 +4566,46 @@
               <w:left w:val="none" w:sz="0" w:space="0" w:color="000000"/>
               <w:right w:val="none" w:sz="0" w:space="0" w:color="000000"/>
             </w:tcBorders>
-            <w:shd w:val="clear" w:color="auto" w:fill="CF707C"/>
-            <w:tcMar>
-              <w:top w:w="0" w:type="dxa"/>
-              <w:bottom w:w="0" w:type="dxa"/>
-              <w:left w:w="0" w:type="dxa"/>
-              <w:right w:w="0" w:type="dxa"/>
-            </w:tcMar>
-            <w:vAlign w:val="center"/>
-          </w:tcPr>
-          <w:p>
-            <w:pPr>
-              <w:pStyle w:val="Normal"/>
-              <w:jc w:val="center"/>
-              <w:pBdr>
-                <w:bottom w:val="none" w:sz="0" w:space="0" w:color="000000"/>
-                <w:top w:val="none" w:sz="0" w:space="0" w:color="000000"/>
-                <w:left w:val="none" w:sz="0" w:space="0" w:color="000000"/>
-                <w:right w:val="none" w:sz="0" w:space="0" w:color="000000"/>
-              </w:pBdr>
-              <w:spacing w:after="100" w:before="100" w:line="240"/>
-              <w:ind w:left="100" w:right="100" w:firstLine="0" w:firstLineChars="0"/>
-              <w:rPr>
-                <w:rFonts w:ascii="Helvetica" w:hAnsi="Helvetica" w:eastAsia="Helvetica" w:cs="Helvetica"/>
-                <w:i w:val="false"/>
-                <w:b w:val="false"/>
-                <w:u w:val="none"/>
-                <w:sz w:val="18"/>
-                <w:szCs w:val="18"/>
-                <w:color w:val="FFFFFF"/>
-              </w:rPr>
-            </w:pPr>
-            <w:r>
-              <w:rPr>
-                <w:rFonts w:ascii="Helvetica" w:hAnsi="Helvetica" w:eastAsia="Helvetica" w:cs="Helvetica"/>
-                <w:i w:val="false"/>
-                <w:b w:val="false"/>
-                <w:u w:val="none"/>
-                <w:sz w:val="18"/>
-                <w:szCs w:val="18"/>
-                <w:color w:val="FFFFFF"/>
+            <w:shd w:val="clear" w:color="auto" w:fill="F24C26"/>
+            <w:tcMar>
+              <w:top w:w="0" w:type="dxa"/>
+              <w:bottom w:w="0" w:type="dxa"/>
+              <w:left w:w="0" w:type="dxa"/>
+              <w:right w:w="0" w:type="dxa"/>
+            </w:tcMar>
+            <w:vAlign w:val="center"/>
+          </w:tcPr>
+          <w:p>
+            <w:pPr>
+              <w:pStyle w:val="Normal"/>
+              <w:jc w:val="center"/>
+              <w:pBdr>
+                <w:bottom w:val="none" w:sz="0" w:space="0" w:color="000000"/>
+                <w:top w:val="none" w:sz="0" w:space="0" w:color="000000"/>
+                <w:left w:val="none" w:sz="0" w:space="0" w:color="000000"/>
+                <w:right w:val="none" w:sz="0" w:space="0" w:color="000000"/>
+              </w:pBdr>
+              <w:spacing w:after="100" w:before="100" w:line="240"/>
+              <w:ind w:left="100" w:right="100" w:firstLine="0" w:firstLineChars="0"/>
+              <w:rPr>
+                <w:rFonts w:ascii="Helvetica" w:hAnsi="Helvetica" w:eastAsia="Helvetica" w:cs="Helvetica"/>
+                <w:i w:val="false"/>
+                <w:b w:val="false"/>
+                <w:u w:val="none"/>
+                <w:sz w:val="18"/>
+                <w:szCs w:val="18"/>
+                <w:color w:val="000000"/>
+              </w:rPr>
+            </w:pPr>
+            <w:r>
+              <w:rPr>
+                <w:rFonts w:ascii="Helvetica" w:hAnsi="Helvetica" w:eastAsia="Helvetica" w:cs="Helvetica"/>
+                <w:i w:val="false"/>
+                <w:b w:val="false"/>
+                <w:u w:val="none"/>
+                <w:sz w:val="18"/>
+                <w:szCs w:val="18"/>
+                <w:color w:val="000000"/>
               </w:rPr>
               <w:t xml:space="preserve">18.5</w:t>
             </w:r>
@@ -4720,7 +4720,7 @@
               <w:left w:val="none" w:sz="0" w:space="0" w:color="000000"/>
               <w:right w:val="none" w:sz="0" w:space="0" w:color="000000"/>
             </w:tcBorders>
-            <w:shd w:val="clear" w:color="auto" w:fill="E8BBC0"/>
+            <w:shd w:val="clear" w:color="auto" w:fill="FEB956"/>
             <w:tcMar>
               <w:top w:w="0" w:type="dxa"/>
               <w:bottom w:w="0" w:type="dxa"/>
@@ -4773,7 +4773,7 @@
               <w:left w:val="none" w:sz="0" w:space="0" w:color="000000"/>
               <w:right w:val="none" w:sz="0" w:space="0" w:color="000000"/>
             </w:tcBorders>
-            <w:shd w:val="clear" w:color="auto" w:fill="DC969E"/>
+            <w:shd w:val="clear" w:color="auto" w:fill="F8873C"/>
             <w:tcMar>
               <w:top w:w="0" w:type="dxa"/>
               <w:bottom w:w="0" w:type="dxa"/>
@@ -4826,7 +4826,7 @@
               <w:left w:val="none" w:sz="0" w:space="0" w:color="000000"/>
               <w:right w:val="none" w:sz="0" w:space="0" w:color="000000"/>
             </w:tcBorders>
-            <w:shd w:val="clear" w:color="auto" w:fill="F3DDE0"/>
+            <w:shd w:val="clear" w:color="auto" w:fill="FED37B"/>
             <w:tcMar>
               <w:top w:w="0" w:type="dxa"/>
               <w:bottom w:w="0" w:type="dxa"/>
@@ -4879,7 +4879,7 @@
               <w:left w:val="none" w:sz="0" w:space="0" w:color="000000"/>
               <w:right w:val="none" w:sz="0" w:space="0" w:color="000000"/>
             </w:tcBorders>
-            <w:shd w:val="clear" w:color="auto" w:fill="D98D96"/>
+            <w:shd w:val="clear" w:color="auto" w:fill="F77836"/>
             <w:tcMar>
               <w:top w:w="0" w:type="dxa"/>
               <w:bottom w:w="0" w:type="dxa"/>
@@ -4932,7 +4932,7 @@
               <w:left w:val="none" w:sz="0" w:space="0" w:color="000000"/>
               <w:right w:val="none" w:sz="0" w:space="0" w:color="000000"/>
             </w:tcBorders>
-            <w:shd w:val="clear" w:color="auto" w:fill="E3ACB3"/>
+            <w:shd w:val="clear" w:color="auto" w:fill="FDA948"/>
             <w:tcMar>
               <w:top w:w="0" w:type="dxa"/>
               <w:bottom w:w="0" w:type="dxa"/>
@@ -4985,7 +4985,7 @@
               <w:left w:val="none" w:sz="0" w:space="0" w:color="000000"/>
               <w:right w:val="none" w:sz="0" w:space="0" w:color="000000"/>
             </w:tcBorders>
-            <w:shd w:val="clear" w:color="auto" w:fill="E8BCC2"/>
+            <w:shd w:val="clear" w:color="auto" w:fill="FEBA57"/>
             <w:tcMar>
               <w:top w:w="0" w:type="dxa"/>
               <w:bottom w:w="0" w:type="dxa"/>
@@ -5038,7 +5038,7 @@
               <w:left w:val="none" w:sz="0" w:space="0" w:color="000000"/>
               <w:right w:val="none" w:sz="0" w:space="0" w:color="000000"/>
             </w:tcBorders>
-            <w:shd w:val="clear" w:color="auto" w:fill="EECCD0"/>
+            <w:shd w:val="clear" w:color="auto" w:fill="FEC668"/>
             <w:tcMar>
               <w:top w:w="0" w:type="dxa"/>
               <w:bottom w:w="0" w:type="dxa"/>
@@ -5091,7 +5091,7 @@
               <w:left w:val="none" w:sz="0" w:space="0" w:color="000000"/>
               <w:right w:val="none" w:sz="0" w:space="0" w:color="000000"/>
             </w:tcBorders>
-            <w:shd w:val="clear" w:color="auto" w:fill="E7B8BD"/>
+            <w:shd w:val="clear" w:color="auto" w:fill="FEB652"/>
             <w:tcMar>
               <w:top w:w="0" w:type="dxa"/>
               <w:bottom w:w="0" w:type="dxa"/>
@@ -5144,7 +5144,7 @@
               <w:left w:val="none" w:sz="0" w:space="0" w:color="000000"/>
               <w:right w:val="none" w:sz="0" w:space="0" w:color="000000"/>
             </w:tcBorders>
-            <w:shd w:val="clear" w:color="auto" w:fill="EDCBCF"/>
+            <w:shd w:val="clear" w:color="auto" w:fill="FEC567"/>
             <w:tcMar>
               <w:top w:w="0" w:type="dxa"/>
               <w:bottom w:w="0" w:type="dxa"/>
@@ -5197,7 +5197,7 @@
               <w:left w:val="none" w:sz="0" w:space="0" w:color="000000"/>
               <w:right w:val="none" w:sz="0" w:space="0" w:color="000000"/>
             </w:tcBorders>
-            <w:shd w:val="clear" w:color="auto" w:fill="E5B3B9"/>
+            <w:shd w:val="clear" w:color="auto" w:fill="FEB34D"/>
             <w:tcMar>
               <w:top w:w="0" w:type="dxa"/>
               <w:bottom w:w="0" w:type="dxa"/>
@@ -5250,7 +5250,7 @@
               <w:left w:val="none" w:sz="0" w:space="0" w:color="000000"/>
               <w:right w:val="none" w:sz="0" w:space="0" w:color="000000"/>
             </w:tcBorders>
-            <w:shd w:val="clear" w:color="auto" w:fill="F1D5D8"/>
+            <w:shd w:val="clear" w:color="auto" w:fill="FECD72"/>
             <w:tcMar>
               <w:top w:w="0" w:type="dxa"/>
               <w:bottom w:w="0" w:type="dxa"/>
@@ -5521,7 +5521,113 @@
               <w:left w:val="none" w:sz="0" w:space="0" w:color="000000"/>
               <w:right w:val="none" w:sz="0" w:space="0" w:color="000000"/>
             </w:tcBorders>
-            <w:shd w:val="clear" w:color="auto" w:fill="CD6A76"/>
+            <w:shd w:val="clear" w:color="auto" w:fill="F04323"/>
+            <w:tcMar>
+              <w:top w:w="0" w:type="dxa"/>
+              <w:bottom w:w="0" w:type="dxa"/>
+              <w:left w:w="0" w:type="dxa"/>
+              <w:right w:w="0" w:type="dxa"/>
+            </w:tcMar>
+            <w:vAlign w:val="center"/>
+          </w:tcPr>
+          <w:p>
+            <w:pPr>
+              <w:pStyle w:val="Normal"/>
+              <w:jc w:val="center"/>
+              <w:pBdr>
+                <w:bottom w:val="none" w:sz="0" w:space="0" w:color="000000"/>
+                <w:top w:val="none" w:sz="0" w:space="0" w:color="000000"/>
+                <w:left w:val="none" w:sz="0" w:space="0" w:color="000000"/>
+                <w:right w:val="none" w:sz="0" w:space="0" w:color="000000"/>
+              </w:pBdr>
+              <w:spacing w:after="100" w:before="100" w:line="240"/>
+              <w:ind w:left="100" w:right="100" w:firstLine="0" w:firstLineChars="0"/>
+              <w:rPr>
+                <w:rFonts w:ascii="Helvetica" w:hAnsi="Helvetica" w:eastAsia="Helvetica" w:cs="Helvetica"/>
+                <w:i w:val="false"/>
+                <w:b w:val="false"/>
+                <w:u w:val="none"/>
+                <w:sz w:val="18"/>
+                <w:szCs w:val="18"/>
+                <w:color w:val="000000"/>
+              </w:rPr>
+            </w:pPr>
+            <w:r>
+              <w:rPr>
+                <w:rFonts w:ascii="Helvetica" w:hAnsi="Helvetica" w:eastAsia="Helvetica" w:cs="Helvetica"/>
+                <w:i w:val="false"/>
+                <w:b w:val="false"/>
+                <w:u w:val="none"/>
+                <w:sz w:val="18"/>
+                <w:szCs w:val="18"/>
+                <w:color w:val="000000"/>
+              </w:rPr>
+              <w:t xml:space="preserve">19.3</w:t>
+            </w:r>
+          </w:p>
+        </w:tc>
+        <w:tc>
+          <w:tcPr>
+            <w:tcBorders>
+              <w:bottom w:val="none" w:sz="0" w:space="0" w:color="000000"/>
+              <w:top w:val="none" w:sz="0" w:space="0" w:color="000000"/>
+              <w:left w:val="none" w:sz="0" w:space="0" w:color="000000"/>
+              <w:right w:val="none" w:sz="0" w:space="0" w:color="000000"/>
+            </w:tcBorders>
+            <w:shd w:val="clear" w:color="auto" w:fill="F03E21"/>
+            <w:tcMar>
+              <w:top w:w="0" w:type="dxa"/>
+              <w:bottom w:w="0" w:type="dxa"/>
+              <w:left w:w="0" w:type="dxa"/>
+              <w:right w:w="0" w:type="dxa"/>
+            </w:tcMar>
+            <w:vAlign w:val="center"/>
+          </w:tcPr>
+          <w:p>
+            <w:pPr>
+              <w:pStyle w:val="Normal"/>
+              <w:jc w:val="center"/>
+              <w:pBdr>
+                <w:bottom w:val="none" w:sz="0" w:space="0" w:color="000000"/>
+                <w:top w:val="none" w:sz="0" w:space="0" w:color="000000"/>
+                <w:left w:val="none" w:sz="0" w:space="0" w:color="000000"/>
+                <w:right w:val="none" w:sz="0" w:space="0" w:color="000000"/>
+              </w:pBdr>
+              <w:spacing w:after="100" w:before="100" w:line="240"/>
+              <w:ind w:left="100" w:right="100" w:firstLine="0" w:firstLineChars="0"/>
+              <w:rPr>
+                <w:rFonts w:ascii="Helvetica" w:hAnsi="Helvetica" w:eastAsia="Helvetica" w:cs="Helvetica"/>
+                <w:i w:val="false"/>
+                <w:b w:val="false"/>
+                <w:u w:val="none"/>
+                <w:sz w:val="18"/>
+                <w:szCs w:val="18"/>
+                <w:color w:val="000000"/>
+              </w:rPr>
+            </w:pPr>
+            <w:r>
+              <w:rPr>
+                <w:rFonts w:ascii="Helvetica" w:hAnsi="Helvetica" w:eastAsia="Helvetica" w:cs="Helvetica"/>
+                <w:i w:val="false"/>
+                <w:b w:val="false"/>
+                <w:u w:val="none"/>
+                <w:sz w:val="18"/>
+                <w:szCs w:val="18"/>
+                <w:color w:val="000000"/>
+              </w:rPr>
+              <w:t xml:space="preserve">19.7</w:t>
+            </w:r>
+          </w:p>
+        </w:tc>
+        <w:tc>
+          <w:tcPr>
+            <w:tcBorders>
+              <w:bottom w:val="none" w:sz="0" w:space="0" w:color="000000"/>
+              <w:top w:val="none" w:sz="0" w:space="0" w:color="000000"/>
+              <w:left w:val="none" w:sz="0" w:space="0" w:color="000000"/>
+              <w:right w:val="none" w:sz="0" w:space="0" w:color="000000"/>
+            </w:tcBorders>
+            <w:shd w:val="clear" w:color="auto" w:fill="DF3122"/>
             <w:tcMar>
               <w:top w:w="0" w:type="dxa"/>
               <w:bottom w:w="0" w:type="dxa"/>
@@ -5562,19 +5668,19 @@
                 <w:szCs w:val="18"/>
                 <w:color w:val="FFFFFF"/>
               </w:rPr>
-              <w:t xml:space="preserve">19.3</w:t>
-            </w:r>
-          </w:p>
-        </w:tc>
-        <w:tc>
-          <w:tcPr>
-            <w:tcBorders>
-              <w:bottom w:val="none" w:sz="0" w:space="0" w:color="000000"/>
-              <w:top w:val="none" w:sz="0" w:space="0" w:color="000000"/>
-              <w:left w:val="none" w:sz="0" w:space="0" w:color="000000"/>
-              <w:right w:val="none" w:sz="0" w:space="0" w:color="000000"/>
-            </w:tcBorders>
-            <w:shd w:val="clear" w:color="auto" w:fill="CC6773"/>
+              <w:t xml:space="preserve">22.7</w:t>
+            </w:r>
+          </w:p>
+        </w:tc>
+        <w:tc>
+          <w:tcPr>
+            <w:tcBorders>
+              <w:bottom w:val="none" w:sz="0" w:space="0" w:color="000000"/>
+              <w:top w:val="none" w:sz="0" w:space="0" w:color="000000"/>
+              <w:left w:val="none" w:sz="0" w:space="0" w:color="000000"/>
+              <w:right w:val="none" w:sz="0" w:space="0" w:color="000000"/>
+            </w:tcBorders>
+            <w:shd w:val="clear" w:color="auto" w:fill="B2182B"/>
             <w:tcMar>
               <w:top w:w="0" w:type="dxa"/>
               <w:bottom w:w="0" w:type="dxa"/>
@@ -5615,19 +5721,19 @@
                 <w:szCs w:val="18"/>
                 <w:color w:val="FFFFFF"/>
               </w:rPr>
-              <w:t xml:space="preserve">19.7</w:t>
-            </w:r>
-          </w:p>
-        </w:tc>
-        <w:tc>
-          <w:tcPr>
-            <w:tcBorders>
-              <w:bottom w:val="none" w:sz="0" w:space="0" w:color="000000"/>
-              <w:top w:val="none" w:sz="0" w:space="0" w:color="000000"/>
-              <w:left w:val="none" w:sz="0" w:space="0" w:color="000000"/>
-              <w:right w:val="none" w:sz="0" w:space="0" w:color="000000"/>
-            </w:tcBorders>
-            <w:shd w:val="clear" w:color="auto" w:fill="C4505E"/>
+              <w:t xml:space="preserve">33.0</w:t>
+            </w:r>
+          </w:p>
+        </w:tc>
+        <w:tc>
+          <w:tcPr>
+            <w:tcBorders>
+              <w:bottom w:val="none" w:sz="0" w:space="0" w:color="000000"/>
+              <w:top w:val="none" w:sz="0" w:space="0" w:color="000000"/>
+              <w:left w:val="none" w:sz="0" w:space="0" w:color="000000"/>
+              <w:right w:val="none" w:sz="0" w:space="0" w:color="000000"/>
+            </w:tcBorders>
+            <w:shd w:val="clear" w:color="auto" w:fill="B2182B"/>
             <w:tcMar>
               <w:top w:w="0" w:type="dxa"/>
               <w:bottom w:w="0" w:type="dxa"/>
@@ -5668,7 +5774,7 @@
                 <w:szCs w:val="18"/>
                 <w:color w:val="FFFFFF"/>
               </w:rPr>
-              <w:t xml:space="preserve">22.7</w:t>
+              <w:t xml:space="preserve">52.1</w:t>
             </w:r>
           </w:p>
         </w:tc>
@@ -5721,7 +5827,7 @@
                 <w:szCs w:val="18"/>
                 <w:color w:val="FFFFFF"/>
               </w:rPr>
-              <w:t xml:space="preserve">33.0</w:t>
+              <w:t xml:space="preserve">35.6</w:t>
             </w:r>
           </w:p>
         </w:tc>
@@ -5774,7 +5880,7 @@
                 <w:szCs w:val="18"/>
                 <w:color w:val="FFFFFF"/>
               </w:rPr>
-              <w:t xml:space="preserve">52.1</w:t>
+              <w:t xml:space="preserve">34.8</w:t>
             </w:r>
           </w:p>
         </w:tc>
@@ -5827,112 +5933,6 @@
                 <w:szCs w:val="18"/>
                 <w:color w:val="FFFFFF"/>
               </w:rPr>
-              <w:t xml:space="preserve">35.6</w:t>
-            </w:r>
-          </w:p>
-        </w:tc>
-        <w:tc>
-          <w:tcPr>
-            <w:tcBorders>
-              <w:bottom w:val="none" w:sz="0" w:space="0" w:color="000000"/>
-              <w:top w:val="none" w:sz="0" w:space="0" w:color="000000"/>
-              <w:left w:val="none" w:sz="0" w:space="0" w:color="000000"/>
-              <w:right w:val="none" w:sz="0" w:space="0" w:color="000000"/>
-            </w:tcBorders>
-            <w:shd w:val="clear" w:color="auto" w:fill="B2182B"/>
-            <w:tcMar>
-              <w:top w:w="0" w:type="dxa"/>
-              <w:bottom w:w="0" w:type="dxa"/>
-              <w:left w:w="0" w:type="dxa"/>
-              <w:right w:w="0" w:type="dxa"/>
-            </w:tcMar>
-            <w:vAlign w:val="center"/>
-          </w:tcPr>
-          <w:p>
-            <w:pPr>
-              <w:pStyle w:val="Normal"/>
-              <w:jc w:val="center"/>
-              <w:pBdr>
-                <w:bottom w:val="none" w:sz="0" w:space="0" w:color="000000"/>
-                <w:top w:val="none" w:sz="0" w:space="0" w:color="000000"/>
-                <w:left w:val="none" w:sz="0" w:space="0" w:color="000000"/>
-                <w:right w:val="none" w:sz="0" w:space="0" w:color="000000"/>
-              </w:pBdr>
-              <w:spacing w:after="100" w:before="100" w:line="240"/>
-              <w:ind w:left="100" w:right="100" w:firstLine="0" w:firstLineChars="0"/>
-              <w:rPr>
-                <w:rFonts w:ascii="Helvetica" w:hAnsi="Helvetica" w:eastAsia="Helvetica" w:cs="Helvetica"/>
-                <w:i w:val="false"/>
-                <w:b w:val="false"/>
-                <w:u w:val="none"/>
-                <w:sz w:val="18"/>
-                <w:szCs w:val="18"/>
-                <w:color w:val="FFFFFF"/>
-              </w:rPr>
-            </w:pPr>
-            <w:r>
-              <w:rPr>
-                <w:rFonts w:ascii="Helvetica" w:hAnsi="Helvetica" w:eastAsia="Helvetica" w:cs="Helvetica"/>
-                <w:i w:val="false"/>
-                <w:b w:val="false"/>
-                <w:u w:val="none"/>
-                <w:sz w:val="18"/>
-                <w:szCs w:val="18"/>
-                <w:color w:val="FFFFFF"/>
-              </w:rPr>
-              <w:t xml:space="preserve">34.8</w:t>
-            </w:r>
-          </w:p>
-        </w:tc>
-        <w:tc>
-          <w:tcPr>
-            <w:tcBorders>
-              <w:bottom w:val="none" w:sz="0" w:space="0" w:color="000000"/>
-              <w:top w:val="none" w:sz="0" w:space="0" w:color="000000"/>
-              <w:left w:val="none" w:sz="0" w:space="0" w:color="000000"/>
-              <w:right w:val="none" w:sz="0" w:space="0" w:color="000000"/>
-            </w:tcBorders>
-            <w:shd w:val="clear" w:color="auto" w:fill="B2182B"/>
-            <w:tcMar>
-              <w:top w:w="0" w:type="dxa"/>
-              <w:bottom w:w="0" w:type="dxa"/>
-              <w:left w:w="0" w:type="dxa"/>
-              <w:right w:w="0" w:type="dxa"/>
-            </w:tcMar>
-            <w:vAlign w:val="center"/>
-          </w:tcPr>
-          <w:p>
-            <w:pPr>
-              <w:pStyle w:val="Normal"/>
-              <w:jc w:val="center"/>
-              <w:pBdr>
-                <w:bottom w:val="none" w:sz="0" w:space="0" w:color="000000"/>
-                <w:top w:val="none" w:sz="0" w:space="0" w:color="000000"/>
-                <w:left w:val="none" w:sz="0" w:space="0" w:color="000000"/>
-                <w:right w:val="none" w:sz="0" w:space="0" w:color="000000"/>
-              </w:pBdr>
-              <w:spacing w:after="100" w:before="100" w:line="240"/>
-              <w:ind w:left="100" w:right="100" w:firstLine="0" w:firstLineChars="0"/>
-              <w:rPr>
-                <w:rFonts w:ascii="Helvetica" w:hAnsi="Helvetica" w:eastAsia="Helvetica" w:cs="Helvetica"/>
-                <w:i w:val="false"/>
-                <w:b w:val="false"/>
-                <w:u w:val="none"/>
-                <w:sz w:val="18"/>
-                <w:szCs w:val="18"/>
-                <w:color w:val="FFFFFF"/>
-              </w:rPr>
-            </w:pPr>
-            <w:r>
-              <w:rPr>
-                <w:rFonts w:ascii="Helvetica" w:hAnsi="Helvetica" w:eastAsia="Helvetica" w:cs="Helvetica"/>
-                <w:i w:val="false"/>
-                <w:b w:val="false"/>
-                <w:u w:val="none"/>
-                <w:sz w:val="18"/>
-                <w:szCs w:val="18"/>
-                <w:color w:val="FFFFFF"/>
-              </w:rPr>
               <w:t xml:space="preserve">41.0</w:t>
             </w:r>
           </w:p>
@@ -5945,7 +5945,7 @@
               <w:left w:val="none" w:sz="0" w:space="0" w:color="000000"/>
               <w:right w:val="none" w:sz="0" w:space="0" w:color="000000"/>
             </w:tcBorders>
-            <w:shd w:val="clear" w:color="auto" w:fill="D78892"/>
+            <w:shd w:val="clear" w:color="auto" w:fill="F67134"/>
             <w:tcMar>
               <w:top w:w="0" w:type="dxa"/>
               <w:bottom w:w="0" w:type="dxa"/>
@@ -6110,7 +6110,7 @@
               <w:left w:val="none" w:sz="0" w:space="0" w:color="000000"/>
               <w:right w:val="none" w:sz="0" w:space="0" w:color="000000"/>
             </w:tcBorders>
-            <w:shd w:val="clear" w:color="auto" w:fill="DE9CA4"/>
+            <w:shd w:val="clear" w:color="auto" w:fill="FA903F"/>
             <w:tcMar>
               <w:top w:w="0" w:type="dxa"/>
               <w:bottom w:w="0" w:type="dxa"/>
@@ -6163,7 +6163,7 @@
               <w:left w:val="none" w:sz="0" w:space="0" w:color="000000"/>
               <w:right w:val="none" w:sz="0" w:space="0" w:color="000000"/>
             </w:tcBorders>
-            <w:shd w:val="clear" w:color="auto" w:fill="D98D96"/>
+            <w:shd w:val="clear" w:color="auto" w:fill="F77836"/>
             <w:tcMar>
               <w:top w:w="0" w:type="dxa"/>
               <w:bottom w:w="0" w:type="dxa"/>
@@ -6216,7 +6216,7 @@
               <w:left w:val="none" w:sz="0" w:space="0" w:color="000000"/>
               <w:right w:val="none" w:sz="0" w:space="0" w:color="000000"/>
             </w:tcBorders>
-            <w:shd w:val="clear" w:color="auto" w:fill="E2AAB1"/>
+            <w:shd w:val="clear" w:color="auto" w:fill="FCA647"/>
             <w:tcMar>
               <w:top w:w="0" w:type="dxa"/>
               <w:bottom w:w="0" w:type="dxa"/>
@@ -6269,7 +6269,7 @@
               <w:left w:val="none" w:sz="0" w:space="0" w:color="000000"/>
               <w:right w:val="none" w:sz="0" w:space="0" w:color="000000"/>
             </w:tcBorders>
-            <w:shd w:val="clear" w:color="auto" w:fill="C85A68"/>
+            <w:shd w:val="clear" w:color="auto" w:fill="E73621"/>
             <w:tcMar>
               <w:top w:w="0" w:type="dxa"/>
               <w:bottom w:w="0" w:type="dxa"/>
@@ -6322,7 +6322,7 @@
               <w:left w:val="none" w:sz="0" w:space="0" w:color="000000"/>
               <w:right w:val="none" w:sz="0" w:space="0" w:color="000000"/>
             </w:tcBorders>
-            <w:shd w:val="clear" w:color="auto" w:fill="D17681"/>
+            <w:shd w:val="clear" w:color="auto" w:fill="F3562A"/>
             <w:tcMar>
               <w:top w:w="0" w:type="dxa"/>
               <w:bottom w:w="0" w:type="dxa"/>
@@ -6375,7 +6375,7 @@
               <w:left w:val="none" w:sz="0" w:space="0" w:color="000000"/>
               <w:right w:val="none" w:sz="0" w:space="0" w:color="000000"/>
             </w:tcBorders>
-            <w:shd w:val="clear" w:color="auto" w:fill="DFA1A8"/>
+            <w:shd w:val="clear" w:color="auto" w:fill="FA9742"/>
             <w:tcMar>
               <w:top w:w="0" w:type="dxa"/>
               <w:bottom w:w="0" w:type="dxa"/>
@@ -6428,7 +6428,7 @@
               <w:left w:val="none" w:sz="0" w:space="0" w:color="000000"/>
               <w:right w:val="none" w:sz="0" w:space="0" w:color="000000"/>
             </w:tcBorders>
-            <w:shd w:val="clear" w:color="auto" w:fill="E9BFC4"/>
+            <w:shd w:val="clear" w:color="auto" w:fill="FEBC5A"/>
             <w:tcMar>
               <w:top w:w="0" w:type="dxa"/>
               <w:bottom w:w="0" w:type="dxa"/>
@@ -6481,7 +6481,7 @@
               <w:left w:val="none" w:sz="0" w:space="0" w:color="000000"/>
               <w:right w:val="none" w:sz="0" w:space="0" w:color="000000"/>
             </w:tcBorders>
-            <w:shd w:val="clear" w:color="auto" w:fill="DC969E"/>
+            <w:shd w:val="clear" w:color="auto" w:fill="F8873C"/>
             <w:tcMar>
               <w:top w:w="0" w:type="dxa"/>
               <w:bottom w:w="0" w:type="dxa"/>
@@ -6534,7 +6534,7 @@
               <w:left w:val="none" w:sz="0" w:space="0" w:color="000000"/>
               <w:right w:val="none" w:sz="0" w:space="0" w:color="000000"/>
             </w:tcBorders>
-            <w:shd w:val="clear" w:color="auto" w:fill="E9BEC3"/>
+            <w:shd w:val="clear" w:color="auto" w:fill="FEBB59"/>
             <w:tcMar>
               <w:top w:w="0" w:type="dxa"/>
               <w:bottom w:w="0" w:type="dxa"/>
@@ -6587,7 +6587,7 @@
               <w:left w:val="none" w:sz="0" w:space="0" w:color="000000"/>
               <w:right w:val="none" w:sz="0" w:space="0" w:color="000000"/>
             </w:tcBorders>
-            <w:shd w:val="clear" w:color="auto" w:fill="DFA1A8"/>
+            <w:shd w:val="clear" w:color="auto" w:fill="FA9742"/>
             <w:tcMar>
               <w:top w:w="0" w:type="dxa"/>
               <w:bottom w:w="0" w:type="dxa"/>
@@ -6640,7 +6640,7 @@
               <w:left w:val="none" w:sz="0" w:space="0" w:color="000000"/>
               <w:right w:val="none" w:sz="0" w:space="0" w:color="000000"/>
             </w:tcBorders>
-            <w:shd w:val="clear" w:color="auto" w:fill="D88A94"/>
+            <w:shd w:val="clear" w:color="auto" w:fill="F67535"/>
             <w:tcMar>
               <w:top w:w="0" w:type="dxa"/>
               <w:bottom w:w="0" w:type="dxa"/>

</xml_diff>